<commit_message>
added book request feature anda frontend
</commit_message>
<xml_diff>
--- a/pagination in django.docx
+++ b/pagination in django.docx
@@ -230,11 +230,9 @@
             <w:hideMark/>
           </w:tcPr>
           <w:p>
-            <w:proofErr w:type="spellStart"/>
             <w:r>
               <w:t>paginator.num_pages</w:t>
             </w:r>
-            <w:proofErr w:type="spellEnd"/>
           </w:p>
         </w:tc>
         <w:tc>
@@ -505,13 +503,8 @@
             <w:hideMark/>
           </w:tcPr>
           <w:p>
-            <w:proofErr w:type="spellStart"/>
-            <w:r>
-              <w:t>paginator.get_elided_page_range</w:t>
-            </w:r>
-            <w:proofErr w:type="spellEnd"/>
-            <w:r>
-              <w:t>(...)</w:t>
+            <w:r>
+              <w:t>paginator.get_elided_page_range(...)</w:t>
             </w:r>
           </w:p>
         </w:tc>
@@ -1367,7 +1360,6 @@
             <w:hideMark/>
           </w:tcPr>
           <w:p>
-            <w:proofErr w:type="spellStart"/>
             <w:r>
               <w:t>page_</w:t>
             </w:r>
@@ -1377,11 +1369,7 @@
             </w:r>
             <w:proofErr w:type="gramEnd"/>
             <w:r>
-              <w:t>_page_number</w:t>
-            </w:r>
-            <w:proofErr w:type="spellEnd"/>
-            <w:r>
-              <w:t>()</w:t>
+              <w:t>_page_number()</w:t>
             </w:r>
           </w:p>
         </w:tc>
@@ -1989,15 +1977,7 @@
       </w:r>
       <w:proofErr w:type="gramEnd"/>
       <w:r>
-        <w:t xml:space="preserve">{ </w:t>
-      </w:r>
-      <w:proofErr w:type="spellStart"/>
-      <w:r>
-        <w:t>page_obj.next_page_number</w:t>
-      </w:r>
-      <w:proofErr w:type="spellEnd"/>
-      <w:r>
-        <w:t xml:space="preserve"> }}"&gt;Next&lt;/a&gt;</w:t>
+        <w:t>{ page_obj.next_page_number }}"&gt;Next&lt;/a&gt;</w:t>
       </w:r>
     </w:p>
     <w:p>

</xml_diff>